<commit_message>
comit băt dau custom trang tạo sản phẩm
</commit_message>
<xml_diff>
--- a/my_custom_addons/dl_wood_traceability/static/TEMPLATES/TEMPLATE_BKLS.docx
+++ b/my_custom_addons/dl_wood_traceability/static/TEMPLATES/TEMPLATE_BKLS.docx
@@ -56,7 +56,7 @@
                 <w:b/>
                 <w:bCs/>
               </w:rPr>
-              <w:t>TRỊNH NGỌC QUÝ</w:t>
+              <w:t>{{forest_owner_name}}</w:t>
             </w:r>
           </w:p>
           <w:p>
@@ -74,7 +74,10 @@
               <w:jc w:val="center"/>
             </w:pPr>
             <w:r>
-              <w:t>Số 01/2026/BKLS</w:t>
+              <w:t xml:space="preserve">Số </w:t>
+            </w:r>
+            <w:r>
+              <w:t>{{bkls_number}}</w:t>
             </w:r>
           </w:p>
         </w:tc>
@@ -944,7 +947,25 @@
                 <w:sz w:val="22"/>
                 <w:szCs w:val="22"/>
               </w:rPr>
-              <w:t>Xã Xuân Lương, ngày 14 tháng 05 năm 2026</w:t>
+              <w:t>{{forest_owner_city}}</w:t>
+            </w:r>
+            <w:r>
+              <w:rPr>
+                <w:i/>
+                <w:iCs/>
+                <w:sz w:val="22"/>
+                <w:szCs w:val="22"/>
+              </w:rPr>
+              <w:t xml:space="preserve">, </w:t>
+            </w:r>
+            <w:r>
+              <w:rPr>
+                <w:i/>
+                <w:iCs/>
+                <w:sz w:val="22"/>
+                <w:szCs w:val="22"/>
+              </w:rPr>
+              <w:t>{{vietnamses_bkls_date}}</w:t>
             </w:r>
           </w:p>
           <w:p>
@@ -1018,7 +1039,61 @@
           <w:sz w:val="22"/>
           <w:szCs w:val="22"/>
         </w:rPr>
-        <w:t>(Kèm theo Bảng kê lâm sản số: 01/2026/BKLS ngày 14 tháng 05 năm 2026 của Trịnh Ngọc Quý)</w:t>
+        <w:t xml:space="preserve">(Kèm theo Bảng kê lâm sản số: </w:t>
+      </w:r>
+      <w:r>
+        <w:rPr>
+          <w:i/>
+          <w:iCs/>
+          <w:sz w:val="22"/>
+          <w:szCs w:val="22"/>
+        </w:rPr>
+        <w:t>{{bkls_number}} {{</w:t>
+      </w:r>
+      <w:r>
+        <w:rPr>
+          <w:i/>
+          <w:iCs/>
+          <w:sz w:val="22"/>
+          <w:szCs w:val="22"/>
+        </w:rPr>
+        <w:t>vietnamese_</w:t>
+      </w:r>
+      <w:r>
+        <w:rPr>
+          <w:i/>
+          <w:iCs/>
+          <w:sz w:val="22"/>
+          <w:szCs w:val="22"/>
+        </w:rPr>
+        <w:t xml:space="preserve">bkls_date}} </w:t>
+      </w:r>
+      <w:r>
+        <w:rPr>
+          <w:i/>
+          <w:iCs/>
+          <w:sz w:val="22"/>
+          <w:szCs w:val="22"/>
+        </w:rPr>
+        <w:t>của</w:t>
+      </w:r>
+      <w:r>
+        <w:rPr>
+          <w:i/>
+          <w:iCs/>
+          <w:sz w:val="22"/>
+          <w:szCs w:val="22"/>
+        </w:rPr>
+        <w:t xml:space="preserve">{{forest_owner_name}} </w:t>
+      </w:r>
+      <w:r>
+        <w:rPr>
+          <w:i/>
+          <w:iCs/>
+          <w:sz w:val="22"/>
+          <w:szCs w:val="22"/>
+        </w:rPr>
+        <w:t>)</w:t>
       </w:r>
     </w:p>
     <w:p>

</xml_diff>

<commit_message>
commit chốt chức năng
</commit_message>
<xml_diff>
--- a/my_custom_addons/dl_wood_traceability/static/TEMPLATES/TEMPLATE_BKLS.docx
+++ b/my_custom_addons/dl_wood_traceability/static/TEMPLATES/TEMPLATE_BKLS.docx
@@ -454,196 +454,95 @@
     <w:p>
       <w:pPr>
         <w:spacing w:line="312" w:lineRule="auto"/>
-      </w:pPr>
-      <w:r>
-        <w:rPr>
-          <w:sz w:val="22"/>
-          <w:szCs w:val="22"/>
-        </w:rPr>
-        <w:t xml:space="preserve">- Khối lượng(Gỗ): </w:t>
-      </w:r>
-      <w:r>
-        <w:rPr>
-          <w:sz w:val="22"/>
-          <w:szCs w:val="22"/>
-        </w:rPr>
-        <w:t>{{species_volume}}</w:t>
-      </w:r>
-      <w:r>
-        <w:rPr>
-          <w:sz w:val="22"/>
-          <w:szCs w:val="22"/>
-        </w:rPr>
-        <w:t xml:space="preserve"> m³ (</w:t>
-      </w:r>
-      <w:r>
-        <w:rPr>
-          <w:sz w:val="22"/>
-          <w:szCs w:val="22"/>
-        </w:rPr>
-        <w:t>{{vietnamese_volume}}</w:t>
-      </w:r>
-      <w:r>
-        <w:rPr>
-          <w:sz w:val="22"/>
-          <w:szCs w:val="22"/>
-        </w:rPr>
-        <w:t xml:space="preserve"> mét khổi</w:t>
-      </w:r>
-      <w:r>
-        <w:rPr>
-          <w:sz w:val="22"/>
-          <w:szCs w:val="22"/>
-        </w:rPr>
-        <w:t>) Đơn vị tính:</w:t>
-      </w:r>
-      <w:r>
-        <w:rPr>
-          <w:sz w:val="22"/>
-          <w:szCs w:val="22"/>
-        </w:rPr>
-        <w:t xml:space="preserve"> </w:t>
-      </w:r>
-      <w:r>
-        <w:rPr>
-          <w:sz w:val="22"/>
-          <w:szCs w:val="22"/>
-        </w:rPr>
-        <w:t>m³ (mét khối)</w:t>
+        <w:rPr>
+          <w:sz w:val="22"/>
+          <w:szCs w:val="22"/>
+        </w:rPr>
+      </w:pPr>
+      <w:r>
+        <w:rPr>
+          <w:sz w:val="22"/>
+          <w:szCs w:val="22"/>
+        </w:rPr>
+        <w:t>{%p for line in species_lines %}</w:t>
       </w:r>
     </w:p>
     <w:p>
       <w:pPr>
         <w:spacing w:line="312" w:lineRule="auto"/>
-      </w:pPr>
-      <w:r>
-        <w:rPr>
-          <w:sz w:val="22"/>
-          <w:szCs w:val="22"/>
-        </w:rPr>
-        <w:t xml:space="preserve">- Số lượng khúc (Gỗ): </w:t>
-      </w:r>
-      <w:r>
-        <w:rPr>
-          <w:sz w:val="22"/>
-          <w:szCs w:val="22"/>
-        </w:rPr>
-        <w:t>{{quantity}}</w:t>
-      </w:r>
-      <w:r>
-        <w:rPr>
-          <w:sz w:val="22"/>
-          <w:szCs w:val="22"/>
-        </w:rPr>
-        <w:t xml:space="preserve"> khúc (</w:t>
-      </w:r>
-      <w:r>
-        <w:rPr>
-          <w:sz w:val="22"/>
-          <w:szCs w:val="22"/>
-        </w:rPr>
-        <w:t xml:space="preserve">{{vietnamese_quantity}} </w:t>
-      </w:r>
-      <w:r>
-        <w:rPr>
-          <w:sz w:val="22"/>
-          <w:szCs w:val="22"/>
-        </w:rPr>
-        <w:t>khúc) Đơn vị tính: khúc (khúc)</w:t>
+        <w:rPr>
+          <w:sz w:val="22"/>
+          <w:szCs w:val="22"/>
+        </w:rPr>
+      </w:pPr>
+      <w:r>
+        <w:rPr>
+          <w:sz w:val="22"/>
+          <w:szCs w:val="22"/>
+        </w:rPr>
+        <w:t>- Khối lượng {{line.species_name}}: {{line.species_volume}} {{line.unit}}  ({{line.vietnamese_volume_unit}}) Đơn vị tính: {{line.unit}} ({{line.vietnamese_unit}})</w:t>
+      </w:r>
+    </w:p>
+    <w:p>
+      <w:pPr>
+        <w:rPr>
+          <w:sz w:val="22"/>
+          <w:szCs w:val="22"/>
+        </w:rPr>
+      </w:pPr>
+      <w:r>
+        <w:rPr>
+          <w:sz w:val="22"/>
+          <w:szCs w:val="22"/>
+        </w:rPr>
+        <w:t>{%p if line.wood_type == 'wood' %}</w:t>
       </w:r>
     </w:p>
     <w:p>
       <w:pPr>
         <w:spacing w:line="312" w:lineRule="auto"/>
-      </w:pPr>
-      <w:r>
-        <w:rPr>
-          <w:sz w:val="22"/>
-          <w:szCs w:val="22"/>
-        </w:rPr>
-        <w:t xml:space="preserve">- Khối lượng(Củi): </w:t>
-      </w:r>
-      <w:r>
-        <w:rPr>
-          <w:sz w:val="22"/>
-          <w:szCs w:val="22"/>
-        </w:rPr>
-        <w:t>{{</w:t>
-      </w:r>
-      <w:r>
-        <w:rPr>
-          <w:sz w:val="22"/>
-          <w:szCs w:val="22"/>
-        </w:rPr>
-        <w:t>firewood</w:t>
-      </w:r>
-      <w:r>
-        <w:rPr>
-          <w:sz w:val="22"/>
-          <w:szCs w:val="22"/>
-        </w:rPr>
-        <w:t>_volume}}</w:t>
-      </w:r>
-      <w:r>
-        <w:rPr>
-          <w:sz w:val="22"/>
-          <w:szCs w:val="22"/>
-        </w:rPr>
-        <w:t xml:space="preserve"> m³ (</w:t>
-      </w:r>
-      <w:r>
-        <w:rPr>
-          <w:sz w:val="22"/>
-          <w:szCs w:val="22"/>
-        </w:rPr>
-        <w:t xml:space="preserve">{{vietnamese_firewood_volume}} </w:t>
-      </w:r>
-      <w:r>
-        <w:rPr>
-          <w:sz w:val="22"/>
-          <w:szCs w:val="22"/>
-        </w:rPr>
-        <w:t>mét khối) Đơn vị tính: m³ (mét khối)</w:t>
+        <w:rPr>
+          <w:sz w:val="22"/>
+          <w:szCs w:val="22"/>
+        </w:rPr>
+      </w:pPr>
+      <w:r>
+        <w:rPr>
+          <w:sz w:val="22"/>
+          <w:szCs w:val="22"/>
+        </w:rPr>
+        <w:t>- Số lượng khúc: {{line.quantity}} khúc ({{line.vietnamese_quantity_lower}} khúc) Đơn vị tính: khúc (khúc)</w:t>
+      </w:r>
+    </w:p>
+    <w:p>
+      <w:pPr>
+        <w:rPr>
+          <w:sz w:val="22"/>
+          <w:szCs w:val="22"/>
+        </w:rPr>
+      </w:pPr>
+      <w:r>
+        <w:rPr>
+          <w:sz w:val="22"/>
+          <w:szCs w:val="22"/>
+        </w:rPr>
+        <w:t>{%p endif %}</w:t>
       </w:r>
     </w:p>
     <w:p>
       <w:pPr>
         <w:spacing w:line="312" w:lineRule="auto"/>
-      </w:pPr>
-      <w:r>
-        <w:rPr>
-          <w:sz w:val="22"/>
-          <w:szCs w:val="22"/>
-        </w:rPr>
-        <w:t xml:space="preserve">- Số lượng khúc (Củi): </w:t>
-      </w:r>
-      <w:r>
-        <w:rPr>
-          <w:sz w:val="22"/>
-          <w:szCs w:val="22"/>
-        </w:rPr>
-        <w:t>{{firewood_quantity}}</w:t>
-      </w:r>
-      <w:r>
-        <w:rPr>
-          <w:sz w:val="22"/>
-          <w:szCs w:val="22"/>
-        </w:rPr>
-        <w:t xml:space="preserve"> khúc (</w:t>
-      </w:r>
-      <w:r>
-        <w:rPr>
-          <w:sz w:val="22"/>
-          <w:szCs w:val="22"/>
-        </w:rPr>
-        <w:t>{{vietnamese_firewood_quantity}}</w:t>
-      </w:r>
-      <w:r>
-        <w:rPr>
-          <w:sz w:val="22"/>
-          <w:szCs w:val="22"/>
-        </w:rPr>
-        <w:t>khúc) Đơn vị tính: khúc (khúc)</w:t>
+        <w:rPr>
+          <w:sz w:val="22"/>
+          <w:szCs w:val="22"/>
+        </w:rPr>
+      </w:pPr>
+      <w:r>
+        <w:rPr>
+          <w:sz w:val="22"/>
+          <w:szCs w:val="22"/>
+        </w:rPr>
+        <w:t>{%p endfor %}</w:t>
       </w:r>
     </w:p>
     <w:p>
@@ -723,7 +622,21 @@
           <w:sz w:val="22"/>
           <w:szCs w:val="22"/>
         </w:rPr>
-        <w:t>{{exploitation_count_day}}</w:t>
+        <w:t>{{</w:t>
+      </w:r>
+      <w:r>
+        <w:rPr>
+          <w:sz w:val="22"/>
+          <w:szCs w:val="22"/>
+        </w:rPr>
+        <w:t>delivery</w:t>
+      </w:r>
+      <w:r>
+        <w:rPr>
+          <w:sz w:val="22"/>
+          <w:szCs w:val="22"/>
+        </w:rPr>
+        <w:t>_count_day}}</w:t>
       </w:r>
       <w:r>
         <w:rPr>
@@ -737,7 +650,35 @@
           <w:sz w:val="22"/>
           <w:szCs w:val="22"/>
         </w:rPr>
-        <w:t xml:space="preserve">{{vietnamese_exploitation_from_date}} </w:t>
+        <w:t>{{vietnamese_</w:t>
+      </w:r>
+      <w:r>
+        <w:rPr>
+          <w:sz w:val="22"/>
+          <w:szCs w:val="22"/>
+        </w:rPr>
+        <w:t>x_delivery</w:t>
+      </w:r>
+      <w:r>
+        <w:rPr>
+          <w:sz w:val="22"/>
+          <w:szCs w:val="22"/>
+        </w:rPr>
+        <w:t>_</w:t>
+      </w:r>
+      <w:r>
+        <w:rPr>
+          <w:sz w:val="22"/>
+          <w:szCs w:val="22"/>
+        </w:rPr>
+        <w:t>start</w:t>
+      </w:r>
+      <w:r>
+        <w:rPr>
+          <w:sz w:val="22"/>
+          <w:szCs w:val="22"/>
+        </w:rPr>
+        <w:t xml:space="preserve">_date}} </w:t>
       </w:r>
       <w:r>
         <w:rPr>
@@ -751,7 +692,21 @@
           <w:sz w:val="22"/>
           <w:szCs w:val="22"/>
         </w:rPr>
-        <w:t>{{vietnamese_exploitation_to_date}}</w:t>
+        <w:t>{{vietnamese_</w:t>
+      </w:r>
+      <w:r>
+        <w:rPr>
+          <w:sz w:val="22"/>
+          <w:szCs w:val="22"/>
+        </w:rPr>
+        <w:t>x_delivery_end</w:t>
+      </w:r>
+      <w:r>
+        <w:rPr>
+          <w:sz w:val="22"/>
+          <w:szCs w:val="22"/>
+        </w:rPr>
+        <w:t>_date}}</w:t>
       </w:r>
       <w:r>
         <w:rPr>
@@ -947,7 +902,7 @@
                 <w:sz w:val="22"/>
                 <w:szCs w:val="22"/>
               </w:rPr>
-              <w:t>{{forest_owner_city}}</w:t>
+              <w:t xml:space="preserve">Xã </w:t>
             </w:r>
             <w:r>
               <w:rPr>
@@ -956,16 +911,7 @@
                 <w:sz w:val="22"/>
                 <w:szCs w:val="22"/>
               </w:rPr>
-              <w:t xml:space="preserve">, </w:t>
-            </w:r>
-            <w:r>
-              <w:rPr>
-                <w:i/>
-                <w:iCs/>
-                <w:sz w:val="22"/>
-                <w:szCs w:val="22"/>
-              </w:rPr>
-              <w:t>{{vietnamses_bkls_date}}</w:t>
+              <w:t>{{forest_owner_city}}, {{vietnamses_bkls_date}}</w:t>
             </w:r>
           </w:p>
           <w:p>
@@ -1076,6 +1022,15 @@
           <w:szCs w:val="22"/>
         </w:rPr>
         <w:t>của</w:t>
+      </w:r>
+      <w:r>
+        <w:rPr>
+          <w:i/>
+          <w:iCs/>
+          <w:sz w:val="22"/>
+          <w:szCs w:val="22"/>
+        </w:rPr>
+        <w:t xml:space="preserve"> </w:t>
       </w:r>
       <w:r>
         <w:rPr>
@@ -1741,6 +1696,36 @@
           </w:tcPr>
           <w:p>
             <w:pPr>
+              <w:jc w:val="center"/>
+              <w:rPr>
+                <w:sz w:val="22"/>
+                <w:szCs w:val="22"/>
+              </w:rPr>
+            </w:pPr>
+            <w:r>
+              <w:rPr>
+                <w:sz w:val="22"/>
+                <w:szCs w:val="22"/>
+              </w:rPr>
+              <w:t xml:space="preserve">{% if </w:t>
+            </w:r>
+            <w:r>
+              <w:rPr>
+                <w:sz w:val="22"/>
+                <w:szCs w:val="22"/>
+              </w:rPr>
+              <w:t>row</w:t>
+            </w:r>
+            <w:r>
+              <w:rPr>
+                <w:sz w:val="22"/>
+                <w:szCs w:val="22"/>
+              </w:rPr>
+              <w:t>.wood_type == 'wood' %}</w:t>
+            </w:r>
+          </w:p>
+          <w:p>
+            <w:pPr>
               <w:spacing w:line="312" w:lineRule="auto"/>
               <w:jc w:val="center"/>
             </w:pPr>
@@ -1751,6 +1736,13 @@
               </w:rPr>
               <w:t>{{row.type}}</w:t>
             </w:r>
+            <w:r>
+              <w:rPr>
+                <w:sz w:val="22"/>
+                <w:szCs w:val="22"/>
+              </w:rPr>
+              <w:t xml:space="preserve"> {% endif %}</w:t>
+            </w:r>
           </w:p>
         </w:tc>
         <w:tc>
@@ -1760,12 +1752,45 @@
           </w:tcPr>
           <w:p>
             <w:pPr>
+              <w:jc w:val="center"/>
+              <w:rPr>
+                <w:sz w:val="22"/>
+                <w:szCs w:val="22"/>
+              </w:rPr>
+            </w:pPr>
+            <w:r>
+              <w:rPr>
+                <w:sz w:val="22"/>
+                <w:szCs w:val="22"/>
+              </w:rPr>
+              <w:t xml:space="preserve">{% if </w:t>
+            </w:r>
+            <w:r>
+              <w:rPr>
+                <w:sz w:val="22"/>
+                <w:szCs w:val="22"/>
+              </w:rPr>
+              <w:t>row</w:t>
+            </w:r>
+            <w:r>
+              <w:rPr>
+                <w:sz w:val="22"/>
+                <w:szCs w:val="22"/>
+              </w:rPr>
+              <w:t>.wood_type == 'wood' %}</w:t>
+            </w:r>
+          </w:p>
+          <w:p>
+            <w:pPr>
               <w:spacing w:line="312" w:lineRule="auto"/>
               <w:jc w:val="center"/>
             </w:pPr>
             <w:r>
               <w:t>{{row.height}}</w:t>
             </w:r>
+            <w:r>
+              <w:t xml:space="preserve"> {% endif %}</w:t>
+            </w:r>
           </w:p>
         </w:tc>
         <w:tc>
@@ -1787,6 +1812,36 @@
           </w:tcPr>
           <w:p>
             <w:pPr>
+              <w:jc w:val="center"/>
+              <w:rPr>
+                <w:sz w:val="22"/>
+                <w:szCs w:val="22"/>
+              </w:rPr>
+            </w:pPr>
+            <w:r>
+              <w:rPr>
+                <w:sz w:val="22"/>
+                <w:szCs w:val="22"/>
+              </w:rPr>
+              <w:t xml:space="preserve">{% if </w:t>
+            </w:r>
+            <w:r>
+              <w:rPr>
+                <w:sz w:val="22"/>
+                <w:szCs w:val="22"/>
+              </w:rPr>
+              <w:t>row</w:t>
+            </w:r>
+            <w:r>
+              <w:rPr>
+                <w:sz w:val="22"/>
+                <w:szCs w:val="22"/>
+              </w:rPr>
+              <w:t>.wood_type == 'wood' %}</w:t>
+            </w:r>
+          </w:p>
+          <w:p>
+            <w:pPr>
               <w:spacing w:line="312" w:lineRule="auto"/>
               <w:jc w:val="center"/>
             </w:pPr>
@@ -1797,6 +1852,13 @@
               </w:rPr>
               <w:t>{{diameter_min}}-{{diameter_max}}</w:t>
             </w:r>
+            <w:r>
+              <w:rPr>
+                <w:sz w:val="22"/>
+                <w:szCs w:val="22"/>
+              </w:rPr>
+              <w:t xml:space="preserve"> {% endif %}</w:t>
+            </w:r>
           </w:p>
         </w:tc>
         <w:tc>
@@ -1806,15 +1868,67 @@
           </w:tcPr>
           <w:p>
             <w:pPr>
-              <w:spacing w:line="312" w:lineRule="auto"/>
-              <w:jc w:val="center"/>
-            </w:pPr>
+              <w:jc w:val="center"/>
+              <w:rPr>
+                <w:sz w:val="22"/>
+                <w:szCs w:val="22"/>
+              </w:rPr>
+            </w:pPr>
+            <w:r>
+              <w:rPr>
+                <w:sz w:val="22"/>
+                <w:szCs w:val="22"/>
+              </w:rPr>
+              <w:t xml:space="preserve">{% if </w:t>
+            </w:r>
+            <w:r>
+              <w:rPr>
+                <w:sz w:val="22"/>
+                <w:szCs w:val="22"/>
+              </w:rPr>
+              <w:t>row</w:t>
+            </w:r>
+            <w:r>
+              <w:rPr>
+                <w:sz w:val="22"/>
+                <w:szCs w:val="22"/>
+              </w:rPr>
+              <w:t>.wood_type == 'wood' %}</w:t>
+            </w:r>
+            <w:r>
+              <w:rPr>
+                <w:sz w:val="22"/>
+                <w:szCs w:val="22"/>
+              </w:rPr>
+              <w:t xml:space="preserve"> </w:t>
+            </w:r>
             <w:r>
               <w:rPr>
                 <w:sz w:val="22"/>
                 <w:szCs w:val="22"/>
               </w:rPr>
               <w:t>{{row.quantity}}</w:t>
+            </w:r>
+            <w:r>
+              <w:rPr>
+                <w:sz w:val="22"/>
+                <w:szCs w:val="22"/>
+              </w:rPr>
+              <w:t xml:space="preserve"> {%</w:t>
+            </w:r>
+            <w:r>
+              <w:rPr>
+                <w:sz w:val="22"/>
+                <w:szCs w:val="22"/>
+              </w:rPr>
+              <w:t xml:space="preserve"> </w:t>
+            </w:r>
+            <w:r>
+              <w:rPr>
+                <w:sz w:val="22"/>
+                <w:szCs w:val="22"/>
+              </w:rPr>
+              <w:t>endif %}</w:t>
             </w:r>
           </w:p>
         </w:tc>

</xml_diff>

<commit_message>
save commit trừ lùi fix địa chỉ
</commit_message>
<xml_diff>
--- a/my_custom_addons/dl_wood_traceability/static/TEMPLATES/TEMPLATE_BKLS.docx
+++ b/my_custom_addons/dl_wood_traceability/static/TEMPLATES/TEMPLATE_BKLS.docx
@@ -902,7 +902,7 @@
                 <w:sz w:val="22"/>
                 <w:szCs w:val="22"/>
               </w:rPr>
-              <w:t xml:space="preserve">Xã </w:t>
+              <w:t>{{forest_owner_ward}}</w:t>
             </w:r>
             <w:r>
               <w:rPr>
@@ -911,7 +911,7 @@
                 <w:sz w:val="22"/>
                 <w:szCs w:val="22"/>
               </w:rPr>
-              <w:t>{{forest_owner_city}}, {{vietnamses_bkls_date}}</w:t>
+              <w:t>, {{vietnamses_bkls_date}}</w:t>
             </w:r>
           </w:p>
           <w:p>

</xml_diff>